<commit_message>
v0.10.12 — PDF now generated from DOCX (identical formatting)
The PDF manual was using a separate reportlab pipeline with
different fonts, layout, and styling. Now replaced with a
DOCX→PDF conversion via LibreOffice:

  build_manual.py:
    Step 1: node build_docx_manual.js (HTML → DOCX)
    Step 2: LibreOffice --convert-to pdf (DOCX → PDF)

Result: PDF is pixel-identical to the approved DOCX manual.
Same Palatino body text, same Cinzel headings, same gold
accents, same table styling, same chapter structure.

Embedded fonts: TeXGyrePagella (Palatino equivalent),
DejaVuSans (Cinzel substitute), DejaVuSansMono (code).
23 pages, 630KB, Letter size.

Single source of truth chain:
  vehicle-forge.html → build_docx_manual.js → .docx → .pdf
</commit_message>
<xml_diff>
--- a/vehicle-forge-manual.docx
+++ b/vehicle-forge-manual.docx
@@ -108,7 +108,7 @@
           <w:sz w:val="20"/>
           <w:szCs w:val="20"/>
         </w:rPr>
-        <w:t xml:space="preserve">v0.10.10 — February 2026</w:t>
+        <w:t xml:space="preserve">v0.10.12 — February 2026</w:t>
       </w:r>
     </w:p>
     <w:p>
@@ -39216,7 +39216,7 @@
           <w:sz w:val="20"/>
           <w:szCs w:val="20"/>
         </w:rPr>
-        <w:t xml:space="preserve">v0.10.10</w:t>
+        <w:t xml:space="preserve">v0.10.12</w:t>
       </w:r>
     </w:p>
     <w:p>
@@ -39246,7 +39246,7 @@
       <w:pPr>
         <w:jc w:val="center"/>
       </w:pPr>
-      <w:hyperlink w:history="1" r:id="rIdhyrxxwdyjkr1yl-hm7sfx">
+      <w:hyperlink w:history="1" r:id="rIdoxlwn3j0lq6t0og-ulcm-">
         <w:r>
           <w:rPr>
             <w:rFonts w:ascii="Palatino Linotype" w:cs="Palatino Linotype" w:eastAsia="Palatino Linotype" w:hAnsi="Palatino Linotype"/>

</xml_diff>